<commit_message>
chore(career): swap in the latest Sept 2026 resume (PDF + Word)
New phone number, "open to on-site, hybrid, or remote" availability, an
Image Horse bullet under the current role, and an end date on the church
volunteer entry. Same filenames, so the two download buttons on
/career-and-resume keep working untouched.

Co-Authored-By: Claude Opus 5 <noreply@anthropic.com>
</commit_message>
<xml_diff>
--- a/public/career-files/Chris_Lane_Jones_Resume_Sept_2026.docx
+++ b/public/career-files/Chris_Lane_Jones_Resume_Sept_2026.docx
@@ -33,11 +33,9 @@
       </w:pPr>
       <w:r>
         <w:rPr>
-          <w:sz w:val="20"/>
-          <w:szCs w:val="20"/>
-          <w:rtl w:val="0"/>
-        </w:rPr>
-        <w:t xml:space="preserve">(540) 324-9798</w:t>
+          <w:rtl w:val="0"/>
+        </w:rPr>
+        <w:t xml:space="preserve">(904) 834-1088‬</w:t>
       </w:r>
       <w:r>
         <w:rPr>
@@ -46,7 +44,7 @@
           <w:szCs w:val="20"/>
           <w:rtl w:val="0"/>
         </w:rPr>
-        <w:t xml:space="preserve">  •  </w:t>
+        <w:t xml:space="preserve"> •  </w:t>
       </w:r>
       <w:r>
         <w:rPr>
@@ -92,7 +90,7 @@
           <w:color w:val="555555"/>
           <w:rtl w:val="0"/>
         </w:rPr>
-        <w:t xml:space="preserve">Jacksonville, FL</w:t>
+        <w:t xml:space="preserve">Jacksonville</w:t>
       </w:r>
       <w:r>
         <w:rPr>
@@ -103,7 +101,36 @@
           <w:szCs w:val="20"/>
           <w:rtl w:val="0"/>
         </w:rPr>
-        <w:t xml:space="preserve">  •  Remote</w:t>
+        <w:t xml:space="preserve">, </w:t>
+      </w:r>
+      <w:r>
+        <w:rPr>
+          <w:i w:val="1"/>
+          <w:iCs w:val="1"/>
+          <w:color w:val="555555"/>
+          <w:rtl w:val="0"/>
+        </w:rPr>
+        <w:t xml:space="preserve">FL</w:t>
+      </w:r>
+      <w:r>
+        <w:rPr>
+          <w:i w:val="1"/>
+          <w:iCs w:val="1"/>
+          <w:color w:val="555555"/>
+          <w:sz w:val="20"/>
+          <w:szCs w:val="20"/>
+          <w:rtl w:val="0"/>
+        </w:rPr>
+        <w:t xml:space="preserve"> •  </w:t>
+      </w:r>
+      <w:r>
+        <w:rPr>
+          <w:i w:val="1"/>
+          <w:iCs w:val="1"/>
+          <w:color w:val="555555"/>
+          <w:rtl w:val="0"/>
+        </w:rPr>
+        <w:t xml:space="preserve">Open to on-site, hybrid, or remote</w:t>
       </w:r>
       <w:r>
         <w:rPr>
@@ -542,12 +569,7 @@
           <w:bottom w:color="6ea34d" w:space="1" w:sz="8" w:val="single"/>
         </w:pBdr>
         <w:spacing w:after="100" w:before="240" w:lineRule="auto"/>
-        <w:rPr>
-          <w:i w:val="1"/>
-          <w:iCs w:val="1"/>
-          <w:sz w:val="20"/>
-          <w:szCs w:val="20"/>
-        </w:rPr>
+        <w:rPr/>
       </w:pPr>
       <w:r>
         <w:rPr>
@@ -566,156 +588,48 @@
         </w:rPr>
       </w:r>
     </w:p>
-    <w:tbl>
-      <w:tblPr>
-        <w:tblStyle w:val="Table1"/>
-        <w:tblW w:w="10155.0" w:type="dxa"/>
-        <w:jc w:val="left"/>
-        <w:tblInd w:w="30.0" w:type="dxa"/>
-        <w:tblBorders>
-          <w:top w:color="ffffff" w:space="0" w:sz="8" w:val="single"/>
-          <w:left w:color="ffffff" w:space="0" w:sz="8" w:val="single"/>
-          <w:bottom w:color="ffffff" w:space="0" w:sz="8" w:val="single"/>
-          <w:right w:color="ffffff" w:space="0" w:sz="8" w:val="single"/>
-          <w:insideH w:color="ffffff" w:space="0" w:sz="8" w:val="single"/>
-          <w:insideV w:color="ffffff" w:space="0" w:sz="8" w:val="single"/>
-        </w:tblBorders>
-        <w:tblLayout w:type="fixed"/>
-        <w:tblLook w:val="0600"/>
-      </w:tblPr>
-      <w:tblGrid>
-        <w:gridCol w:w="7170"/>
-        <w:gridCol w:w="2985"/>
-        <w:tblGridChange w:id="0">
-          <w:tblGrid>
-            <w:gridCol w:w="7170"/>
-            <w:gridCol w:w="2985"/>
-          </w:tblGrid>
-        </w:tblGridChange>
-      </w:tblGrid>
-      <w:tr>
-        <w:trPr>
-          <w:cantSplit w:val="0"/>
-          <w:tblHeader w:val="0"/>
-        </w:trPr>
-        <w:tc>
-          <w:tcPr>
-            <w:shd w:fill="auto" w:val="clear"/>
-            <w:tcMar>
-              <w:top w:w="0.0" w:type="dxa"/>
-              <w:left w:w="0.0" w:type="dxa"/>
-              <w:bottom w:w="0.0" w:type="dxa"/>
-              <w:right w:w="0.0" w:type="dxa"/>
-            </w:tcMar>
-          </w:tcPr>
-          <w:p>
-            <w:pPr>
-              <w:tabs>
-                <w:tab w:val="right" w:leader="none" w:pos="10080"/>
-              </w:tabs>
-              <w:spacing w:before="200" w:lineRule="auto"/>
-              <w:rPr/>
-            </w:pPr>
-            <w:r>
-              <w:rPr>
-                <w:b w:val="1"/>
-                <w:bCs w:val="1"/>
-                <w:sz w:val="22"/>
-                <w:szCs w:val="22"/>
-                <w:rtl w:val="0"/>
-              </w:rPr>
-              <w:t xml:space="preserve">Virginia Information Technologies Agency (VITA)                                                                               </w:t>
-            </w:r>
-            <w:r>
-              <w:rPr>
-                <w:rtl w:val="0"/>
-              </w:rPr>
-            </w:r>
-          </w:p>
-          <w:p>
-            <w:pPr>
-              <w:tabs>
-                <w:tab w:val="right" w:leader="none" w:pos="10080"/>
-              </w:tabs>
-              <w:spacing w:after="80" w:lineRule="auto"/>
-              <w:rPr>
-                <w:i w:val="1"/>
-                <w:iCs w:val="1"/>
-              </w:rPr>
-            </w:pPr>
-            <w:r>
-              <w:rPr>
-                <w:i w:val="1"/>
-                <w:iCs w:val="1"/>
-                <w:rtl w:val="0"/>
-              </w:rPr>
-              <w:t xml:space="preserve">Senior Web Engineer | AI Automation &amp; CMS Architect                                                                                                               </w:t>
-            </w:r>
-          </w:p>
-        </w:tc>
-        <w:tc>
-          <w:tcPr>
-            <w:shd w:fill="auto" w:val="clear"/>
-            <w:tcMar>
-              <w:top w:w="0.0" w:type="dxa"/>
-              <w:left w:w="0.0" w:type="dxa"/>
-              <w:bottom w:w="0.0" w:type="dxa"/>
-              <w:right w:w="0.0" w:type="dxa"/>
-            </w:tcMar>
-            <w:vAlign w:val="top"/>
-          </w:tcPr>
-          <w:p>
-            <w:pPr>
-              <w:tabs>
-                <w:tab w:val="right" w:leader="none" w:pos="10080"/>
-              </w:tabs>
-              <w:spacing w:before="200" w:lineRule="auto"/>
-              <w:jc w:val="right"/>
-              <w:rPr>
-                <w:i w:val="1"/>
-                <w:iCs w:val="1"/>
-                <w:sz w:val="20"/>
-                <w:szCs w:val="20"/>
-              </w:rPr>
-            </w:pPr>
-            <w:r>
-              <w:rPr>
-                <w:b w:val="1"/>
-                <w:bCs w:val="1"/>
-                <w:sz w:val="22"/>
-                <w:szCs w:val="22"/>
-                <w:rtl w:val="0"/>
-              </w:rPr>
-              <w:t xml:space="preserve">Feb 2023 – Present</w:t>
-            </w:r>
-            <w:r>
-              <w:rPr>
-                <w:i w:val="1"/>
-                <w:iCs w:val="1"/>
-                <w:rtl w:val="0"/>
-              </w:rPr>
-              <w:t xml:space="preserve">                                                                                                          Remote</w:t>
-            </w:r>
-            <w:r>
-              <w:rPr>
-                <w:rtl w:val="0"/>
-              </w:rPr>
-            </w:r>
-          </w:p>
-        </w:tc>
-      </w:tr>
-    </w:tbl>
+    <w:p>
+      <w:pPr>
+        <w:tabs>
+          <w:tab w:val="right" w:leader="none" w:pos="10080"/>
+        </w:tabs>
+        <w:spacing w:after="0" w:before="200" w:lineRule="auto"/>
+        <w:rPr/>
+      </w:pPr>
+      <w:r>
+        <w:rPr>
+          <w:b w:val="1"/>
+          <w:bCs w:val="1"/>
+          <w:sz w:val="22"/>
+          <w:szCs w:val="22"/>
+          <w:rtl w:val="0"/>
+        </w:rPr>
+        <w:t xml:space="preserve">Virginia Information Technologies Agency (VITA)                                                                                Feb 2023 – Present</w:t>
+      </w:r>
+      <w:r>
+        <w:rPr>
+          <w:rtl w:val="0"/>
+        </w:rPr>
+      </w:r>
+    </w:p>
     <w:p>
       <w:pPr>
         <w:tabs>
           <w:tab w:val="right" w:leader="none" w:pos="10080"/>
         </w:tabs>
         <w:spacing w:after="80" w:before="0" w:lineRule="auto"/>
+        <w:rPr/>
+      </w:pPr>
+      <w:r>
         <w:rPr>
           <w:i w:val="1"/>
           <w:iCs w:val="1"/>
-        </w:rPr>
-      </w:pPr>
+          <w:sz w:val="20"/>
+          <w:szCs w:val="20"/>
+          <w:rtl w:val="0"/>
+        </w:rPr>
+        <w:t xml:space="preserve">Senior Web Engineer | AI Automation &amp; CMS Architect                                                                                                               Remote</w:t>
+      </w:r>
       <w:r>
         <w:rPr>
           <w:rtl w:val="0"/>
@@ -1197,7 +1111,7 @@
           <w:between w:space="0" w:sz="0" w:val="nil"/>
         </w:pBdr>
         <w:shd w:fill="auto" w:val="clear"/>
-        <w:spacing w:after="40" w:before="0" w:line="240" w:lineRule="auto"/>
+        <w:spacing w:after="40" w:afterAutospacing="0" w:before="0" w:line="240" w:lineRule="auto"/>
         <w:ind w:left="360" w:right="0" w:hanging="220"/>
         <w:jc w:val="left"/>
         <w:rPr/>
@@ -1245,6 +1159,74 @@
           <w:rtl w:val="0"/>
         </w:rPr>
         <w:t xml:space="preserve">and Terminal Four for state agencies and private-sector clients.</w:t>
+      </w:r>
+      <w:r>
+        <w:rPr>
+          <w:rtl w:val="0"/>
+        </w:rPr>
+      </w:r>
+    </w:p>
+    <w:p>
+      <w:pPr>
+        <w:numPr>
+          <w:ilvl w:val="0"/>
+          <w:numId w:val="1"/>
+        </w:numPr>
+        <w:spacing w:after="0" w:afterAutospacing="0" w:before="40" w:beforeAutospacing="0" w:lineRule="auto"/>
+        <w:ind w:left="360" w:hanging="220"/>
+        <w:rPr>
+          <w:rFonts w:ascii="Arial" w:cs="Arial" w:eastAsia="Arial" w:hAnsi="Arial"/>
+          <w:sz w:val="22"/>
+          <w:szCs w:val="22"/>
+        </w:rPr>
+      </w:pPr>
+      <w:r>
+        <w:rPr>
+          <w:rtl w:val="0"/>
+        </w:rPr>
+        <w:t xml:space="preserve">Built and ship a browser-based photo editor with a Rust image engine compiled to WASM. Moving the engine into a Web Worker cut main-thread blocking from ~130 ms to 0.</w:t>
+      </w:r>
+    </w:p>
+    <w:p>
+      <w:pPr>
+        <w:numPr>
+          <w:ilvl w:val="0"/>
+          <w:numId w:val="1"/>
+        </w:numPr>
+        <w:spacing w:after="0" w:afterAutospacing="0" w:before="0" w:beforeAutospacing="0" w:lineRule="auto"/>
+        <w:ind w:left="360" w:hanging="220"/>
+        <w:rPr>
+          <w:rFonts w:ascii="Arial" w:cs="Arial" w:eastAsia="Arial" w:hAnsi="Arial"/>
+          <w:sz w:val="22"/>
+          <w:szCs w:val="22"/>
+        </w:rPr>
+      </w:pPr>
+      <w:r>
+        <w:rPr>
+          <w:rtl w:val="0"/>
+        </w:rPr>
+        <w:t xml:space="preserve">Run it like a production product: 100 releases in a single month, architecture decision records, a QC gate on every release, and a CI size check on the WASM bundle.</w:t>
+      </w:r>
+    </w:p>
+    <w:p>
+      <w:pPr>
+        <w:numPr>
+          <w:ilvl w:val="0"/>
+          <w:numId w:val="1"/>
+        </w:numPr>
+        <w:spacing w:after="0" w:afterAutospacing="0" w:before="0" w:beforeAutospacing="0" w:lineRule="auto"/>
+        <w:ind w:left="360" w:hanging="220"/>
+        <w:rPr>
+          <w:rFonts w:ascii="Arial" w:cs="Arial" w:eastAsia="Arial" w:hAnsi="Arial"/>
+          <w:sz w:val="22"/>
+          <w:szCs w:val="22"/>
+        </w:rPr>
+      </w:pPr>
+      <w:r>
+        <w:rPr>
+          <w:rtl w:val="0"/>
+        </w:rPr>
+        <w:t xml:space="preserve">Built cross-device settings sync, share links, a beta invite system, and a paid tier with server-enforced entitlements.</w:t>
       </w:r>
     </w:p>
     <w:p>
@@ -3074,7 +3056,6 @@
           <w:rtl w:val="0"/>
         </w:rPr>
         <w:t xml:space="preserve">Web.com</w:t>
-        <w:tab/>
       </w:r>
       <w:r>
         <w:rPr>
@@ -3084,6 +3065,7 @@
           <w:szCs w:val="22"/>
           <w:rtl w:val="0"/>
         </w:rPr>
+        <w:tab/>
         <w:t xml:space="preserve">Oct 2015 – Sept 2018</w:t>
       </w:r>
       <w:r>
@@ -3387,12 +3369,13 @@
           <w:szCs w:val="20"/>
           <w:rtl w:val="0"/>
         </w:rPr>
-        <w:t xml:space="preserve"> — Stage Production Lights / Parking Services  |  Louisa, VA  |  May 2020 – Present</w:t>
-      </w:r>
-      <w:r>
-        <w:rPr>
-          <w:rtl w:val="0"/>
-        </w:rPr>
+        <w:t xml:space="preserve"> — Stage Production Lights / Parking Services  |  Louisa, VA  |  May 2020 – </w:t>
+      </w:r>
+      <w:r>
+        <w:rPr>
+          <w:rtl w:val="0"/>
+        </w:rPr>
+        <w:t xml:space="preserve">Sept 2026</w:t>
       </w:r>
     </w:p>
     <w:p>
@@ -3426,21 +3409,35 @@
           <w:tab w:val="right" w:leader="none" w:pos="10080"/>
         </w:tabs>
         <w:spacing w:after="0" w:before="0" w:lineRule="auto"/>
-        <w:rPr>
-          <w:sz w:val="22"/>
-          <w:szCs w:val="22"/>
-        </w:rPr>
+        <w:rPr/>
       </w:pPr>
       <w:r>
         <w:rPr>
           <w:b w:val="1"/>
           <w:bCs w:val="1"/>
-          <w:sz w:val="22"/>
-          <w:szCs w:val="22"/>
-          <w:rtl w:val="0"/>
-        </w:rPr>
-        <w:t xml:space="preserve">University of North Florida </w:t>
+          <w:sz w:val="20"/>
+          <w:szCs w:val="20"/>
+          <w:rtl w:val="0"/>
+        </w:rPr>
+        <w:t xml:space="preserve">University of North Florida</w:t>
+      </w:r>
+      <w:r>
+        <w:rPr>
+          <w:b w:val="1"/>
+          <w:bCs w:val="1"/>
+          <w:rtl w:val="0"/>
+        </w:rPr>
+        <w:t xml:space="preserve"> </w:t>
         <w:tab/>
+      </w:r>
+      <w:r>
+        <w:rPr>
+          <w:b w:val="1"/>
+          <w:bCs w:val="1"/>
+          <w:sz w:val="20"/>
+          <w:szCs w:val="20"/>
+          <w:rtl w:val="0"/>
+        </w:rPr>
         <w:t xml:space="preserve">Graduated August 2013</w:t>
       </w:r>
       <w:r>
@@ -3887,50 +3884,6 @@
       <w:sz w:val="48"/>
       <w:szCs w:val="48"/>
     </w:rPr>
-  </w:style>
-  <w:style w:type="table" w:styleId="Table1">
-    <w:basedOn w:val="TableNormal"/>
-    <w:tblPr>
-      <w:tblStyleRowBandSize w:val="1"/>
-      <w:tblStyleColBandSize w:val="1"/>
-      <w:tblCellMar/>
-    </w:tblPr>
-    <w:tblStylePr w:type="band1Horz">
-      <w:tcPr/>
-    </w:tblStylePr>
-    <w:tblStylePr w:type="band1Vert">
-      <w:tcPr/>
-    </w:tblStylePr>
-    <w:tblStylePr w:type="band2Horz">
-      <w:tcPr/>
-    </w:tblStylePr>
-    <w:tblStylePr w:type="band2Vert">
-      <w:tcPr/>
-    </w:tblStylePr>
-    <w:tblStylePr w:type="firstCol">
-      <w:tcPr/>
-    </w:tblStylePr>
-    <w:tblStylePr w:type="firstRow">
-      <w:tcPr/>
-    </w:tblStylePr>
-    <w:tblStylePr w:type="lastCol">
-      <w:tcPr/>
-    </w:tblStylePr>
-    <w:tblStylePr w:type="lastRow">
-      <w:tcPr/>
-    </w:tblStylePr>
-    <w:tblStylePr w:type="neCell">
-      <w:tcPr/>
-    </w:tblStylePr>
-    <w:tblStylePr w:type="nwCell">
-      <w:tcPr/>
-    </w:tblStylePr>
-    <w:tblStylePr w:type="seCell">
-      <w:tcPr/>
-    </w:tblStylePr>
-    <w:tblStylePr w:type="swCell">
-      <w:tcPr/>
-    </w:tblStylePr>
   </w:style>
 </w:styles>
 </file>
@@ -4253,4 +4206,19 @@
   </a:objectDefaults>
   <a:extraClrSchemeLst/>
 </a:theme>
+</file>
+
+<file path=customXML/item1.xml><?xml version="1.0" encoding="utf-8"?>
+<go:gDocsCustomXmlDataStorage xmlns:go="http://customooxmlschemas.google.com/" xmlns:r="http://schemas.openxmlformats.org/officeDocument/2006/relationships" uri="GoogleDocsCustomDataVersion2">
+  <go:docsCustomData xmlns:go="http://customooxmlschemas.google.com/" roundtripDataSignature="AMtx7mggttszxxywz9E8Hg0gkgOAR6DCRA==">CgMxLjA4AHIhMUhwcGo0NHpvRG5zYnM4YUNTZGNjMl83YW5HQmtmUHkw</go:docsCustomData>
+</go:gDocsCustomXmlDataStorage>
+</file>
+
+<file path=customXML/itemProps1.xml><?xml version="1.0" encoding="utf-8"?>
+<ds:datastoreItem xmlns:ds="http://schemas.openxmlformats.org/officeDocument/2006/customXml" ds:itemID="{11111111-1234-1234-1234-123412341234}">
+  <ds:schemaRefs>
+    <ds:schemaRef ds:uri="http://schemas.openxmlformats.org/officeDocument/2006/relationships"/>
+    <ds:schemaRef ds:uri="http://customooxmlschemas.google.com/"/>
+  </ds:schemaRefs>
+</ds:datastoreItem>
 </file>
</xml_diff>